<commit_message>
Optimize LCP and hero animations
</commit_message>
<xml_diff>
--- a/PEKCON_günlük/Sen kıdemli bir Tracking.docx
+++ b/PEKCON_günlük/Sen kıdemli bir Tracking.docx
@@ -1611,7 +1611,7 @@
     <w:p>
       <w:r>
         <w:pict w14:anchorId="5A1827A9">
-          <v:rect id="_x0000_i1067" style="width:0;height:1.5pt" o:hralign="center" o:hrstd="t" o:hr="t" fillcolor="#a0a0a0" stroked="f"/>
+          <v:rect id="_x0000_i1025" style="width:0;height:1.5pt" o:hralign="center" o:hrstd="t" o:hr="t" fillcolor="#a0a0a0" stroked="f"/>
         </w:pict>
       </w:r>
     </w:p>
@@ -1641,7 +1641,7 @@
     <w:p>
       <w:r>
         <w:pict w14:anchorId="6BB6633F">
-          <v:rect id="_x0000_i1068" style="width:0;height:1.5pt" o:hralign="center" o:hrstd="t" o:hr="t" fillcolor="#a0a0a0" stroked="f"/>
+          <v:rect id="_x0000_i1026" style="width:0;height:1.5pt" o:hralign="center" o:hrstd="t" o:hr="t" fillcolor="#a0a0a0" stroked="f"/>
         </w:pict>
       </w:r>
     </w:p>
@@ -2724,7 +2724,7 @@
     <w:p>
       <w:r>
         <w:pict w14:anchorId="4F0A5475">
-          <v:rect id="_x0000_i1069" style="width:0;height:1.5pt" o:hralign="center" o:hrstd="t" o:hr="t" fillcolor="#a0a0a0" stroked="f"/>
+          <v:rect id="_x0000_i1027" style="width:0;height:1.5pt" o:hralign="center" o:hrstd="t" o:hr="t" fillcolor="#a0a0a0" stroked="f"/>
         </w:pict>
       </w:r>
     </w:p>
@@ -5447,7 +5447,7 @@
     <w:p>
       <w:r>
         <w:pict w14:anchorId="5A56EDFC">
-          <v:rect id="_x0000_i1070" style="width:0;height:1.5pt" o:hralign="center" o:hrstd="t" o:hr="t" fillcolor="#a0a0a0" stroked="f"/>
+          <v:rect id="_x0000_i1028" style="width:0;height:1.5pt" o:hralign="center" o:hrstd="t" o:hr="t" fillcolor="#a0a0a0" stroked="f"/>
         </w:pict>
       </w:r>
     </w:p>
@@ -6212,7 +6212,7 @@
     <w:p>
       <w:r>
         <w:pict w14:anchorId="53F4C273">
-          <v:rect id="_x0000_i1071" style="width:0;height:1.5pt" o:hralign="center" o:hrstd="t" o:hr="t" fillcolor="#a0a0a0" stroked="f"/>
+          <v:rect id="_x0000_i1029" style="width:0;height:1.5pt" o:hralign="center" o:hrstd="t" o:hr="t" fillcolor="#a0a0a0" stroked="f"/>
         </w:pict>
       </w:r>
     </w:p>
@@ -6762,7 +6762,7 @@
       <w:r>
         <w:lastRenderedPageBreak/>
         <w:pict w14:anchorId="6FD490D0">
-          <v:rect id="_x0000_i1072" style="width:0;height:1.5pt" o:hralign="center" o:hrstd="t" o:hr="t" fillcolor="#a0a0a0" stroked="f"/>
+          <v:rect id="_x0000_i1030" style="width:0;height:1.5pt" o:hralign="center" o:hrstd="t" o:hr="t" fillcolor="#a0a0a0" stroked="f"/>
         </w:pict>
       </w:r>
     </w:p>
@@ -7181,15 +7181,41 @@
       </w:r>
       <w:proofErr w:type="spellEnd"/>
       <w:r>
+        <w:t xml:space="preserve"> Tag          </w:t>
+      </w:r>
+      <w:r>
+        <w:rPr>
+          <w:rFonts w:ascii="Aptos" w:hAnsi="Aptos" w:cs="Aptos"/>
+        </w:rPr>
+        <w:t>│</w:t>
+      </w:r>
+    </w:p>
+    <w:p>
+      <w:r>
+        <w:t xml:space="preserve">│                             </w:t>
+      </w:r>
+      <w:r>
+        <w:rPr>
+          <w:rFonts w:ascii="Microsoft YaHei" w:eastAsia="Microsoft YaHei" w:hAnsi="Microsoft YaHei" w:cs="Microsoft YaHei" w:hint="eastAsia"/>
+        </w:rPr>
+        <w:t>├</w:t>
+      </w:r>
+      <w:r>
+        <w:rPr>
+          <w:rFonts w:ascii="Aptos" w:hAnsi="Aptos" w:cs="Aptos"/>
+        </w:rPr>
+        <w:t>──</w:t>
+      </w:r>
+      <w:r>
         <w:t xml:space="preserve"> </w:t>
       </w:r>
       <w:proofErr w:type="spellStart"/>
       <w:r>
-        <w:t>Tag</w:t>
-      </w:r>
-      <w:proofErr w:type="spellEnd"/>
-      <w:r>
-        <w:t xml:space="preserve">          </w:t>
+        <w:t>GAds</w:t>
+      </w:r>
+      <w:proofErr w:type="spellEnd"/>
+      <w:r>
+        <w:t xml:space="preserve"> Conversion Tag    </w:t>
       </w:r>
       <w:r>
         <w:rPr>
@@ -7219,19 +7245,19 @@
       </w:r>
       <w:proofErr w:type="spellStart"/>
       <w:r>
-        <w:t>GAds</w:t>
-      </w:r>
-      <w:proofErr w:type="spellEnd"/>
-      <w:r>
-        <w:t xml:space="preserve"> Conversion </w:t>
-      </w:r>
-      <w:proofErr w:type="spellStart"/>
-      <w:r>
-        <w:t>Tag</w:t>
-      </w:r>
-      <w:proofErr w:type="spellEnd"/>
-      <w:r>
-        <w:t xml:space="preserve">    </w:t>
+        <w:t>Conv</w:t>
+      </w:r>
+      <w:proofErr w:type="spellEnd"/>
+      <w:r>
+        <w:t xml:space="preserve">. </w:t>
+      </w:r>
+      <w:proofErr w:type="spellStart"/>
+      <w:r>
+        <w:t>Linker</w:t>
+      </w:r>
+      <w:proofErr w:type="spellEnd"/>
+      <w:r>
+        <w:t xml:space="preserve"> Tag       </w:t>
       </w:r>
       <w:r>
         <w:rPr>
@@ -7261,69 +7287,11 @@
       </w:r>
       <w:proofErr w:type="spellStart"/>
       <w:r>
-        <w:t>Conv</w:t>
-      </w:r>
-      <w:proofErr w:type="spellEnd"/>
-      <w:r>
-        <w:t xml:space="preserve">. </w:t>
-      </w:r>
-      <w:proofErr w:type="spellStart"/>
-      <w:r>
-        <w:t>Linker</w:t>
-      </w:r>
-      <w:proofErr w:type="spellEnd"/>
-      <w:r>
-        <w:t xml:space="preserve"> </w:t>
-      </w:r>
-      <w:proofErr w:type="spellStart"/>
-      <w:r>
-        <w:t>Tag</w:t>
-      </w:r>
-      <w:proofErr w:type="spellEnd"/>
-      <w:r>
-        <w:t xml:space="preserve">       </w:t>
-      </w:r>
-      <w:r>
-        <w:rPr>
-          <w:rFonts w:ascii="Aptos" w:hAnsi="Aptos" w:cs="Aptos"/>
-        </w:rPr>
-        <w:t>│</w:t>
-      </w:r>
-    </w:p>
-    <w:p>
-      <w:r>
-        <w:t xml:space="preserve">│                             </w:t>
-      </w:r>
-      <w:r>
-        <w:rPr>
-          <w:rFonts w:ascii="Microsoft YaHei" w:eastAsia="Microsoft YaHei" w:hAnsi="Microsoft YaHei" w:cs="Microsoft YaHei" w:hint="eastAsia"/>
-        </w:rPr>
-        <w:t>├</w:t>
-      </w:r>
-      <w:r>
-        <w:rPr>
-          <w:rFonts w:ascii="Aptos" w:hAnsi="Aptos" w:cs="Aptos"/>
-        </w:rPr>
-        <w:t>──</w:t>
-      </w:r>
-      <w:r>
-        <w:t xml:space="preserve"> </w:t>
-      </w:r>
-      <w:proofErr w:type="spellStart"/>
-      <w:r>
         <w:t>Enhanced</w:t>
       </w:r>
       <w:proofErr w:type="spellEnd"/>
       <w:r>
-        <w:t xml:space="preserve"> </w:t>
-      </w:r>
-      <w:proofErr w:type="spellStart"/>
-      <w:r>
-        <w:t>Conversions</w:t>
-      </w:r>
-      <w:proofErr w:type="spellEnd"/>
-      <w:r>
-        <w:t xml:space="preserve">   </w:t>
+        <w:t xml:space="preserve"> Conversions   </w:t>
       </w:r>
       <w:r>
         <w:rPr>
@@ -7642,8 +7610,8 @@
         <w:tblLook w:val="04A0" w:firstRow="1" w:lastRow="0" w:firstColumn="1" w:lastColumn="0" w:noHBand="0" w:noVBand="1"/>
       </w:tblPr>
       <w:tblGrid>
-        <w:gridCol w:w="332"/>
-        <w:gridCol w:w="5153"/>
+        <w:gridCol w:w="567"/>
+        <w:gridCol w:w="4918"/>
         <w:gridCol w:w="1216"/>
         <w:gridCol w:w="905"/>
         <w:gridCol w:w="1155"/>
@@ -7655,7 +7623,7 @@
         </w:trPr>
         <w:tc>
           <w:tcPr>
-            <w:tcW w:w="0" w:type="auto"/>
+            <w:tcW w:w="522" w:type="dxa"/>
             <w:vAlign w:val="center"/>
             <w:hideMark/>
           </w:tcPr>
@@ -7677,7 +7645,7 @@
         </w:tc>
         <w:tc>
           <w:tcPr>
-            <w:tcW w:w="0" w:type="auto"/>
+            <w:tcW w:w="4888" w:type="dxa"/>
             <w:vAlign w:val="center"/>
             <w:hideMark/>
           </w:tcPr>
@@ -7770,7 +7738,7 @@
         </w:trPr>
         <w:tc>
           <w:tcPr>
-            <w:tcW w:w="0" w:type="auto"/>
+            <w:tcW w:w="522" w:type="dxa"/>
             <w:vAlign w:val="center"/>
             <w:hideMark/>
           </w:tcPr>
@@ -7782,7 +7750,7 @@
         </w:tc>
         <w:tc>
           <w:tcPr>
-            <w:tcW w:w="0" w:type="auto"/>
+            <w:tcW w:w="4888" w:type="dxa"/>
             <w:vAlign w:val="center"/>
             <w:hideMark/>
           </w:tcPr>
@@ -7854,7 +7822,7 @@
         </w:trPr>
         <w:tc>
           <w:tcPr>
-            <w:tcW w:w="0" w:type="auto"/>
+            <w:tcW w:w="522" w:type="dxa"/>
             <w:vAlign w:val="center"/>
             <w:hideMark/>
           </w:tcPr>
@@ -7866,7 +7834,7 @@
         </w:tc>
         <w:tc>
           <w:tcPr>
-            <w:tcW w:w="0" w:type="auto"/>
+            <w:tcW w:w="4888" w:type="dxa"/>
             <w:vAlign w:val="center"/>
             <w:hideMark/>
           </w:tcPr>
@@ -7925,7 +7893,7 @@
         </w:trPr>
         <w:tc>
           <w:tcPr>
-            <w:tcW w:w="0" w:type="auto"/>
+            <w:tcW w:w="522" w:type="dxa"/>
             <w:vAlign w:val="center"/>
             <w:hideMark/>
           </w:tcPr>
@@ -7937,7 +7905,7 @@
         </w:tc>
         <w:tc>
           <w:tcPr>
-            <w:tcW w:w="0" w:type="auto"/>
+            <w:tcW w:w="4888" w:type="dxa"/>
             <w:vAlign w:val="center"/>
             <w:hideMark/>
           </w:tcPr>
@@ -8009,7 +7977,7 @@
         </w:trPr>
         <w:tc>
           <w:tcPr>
-            <w:tcW w:w="0" w:type="auto"/>
+            <w:tcW w:w="522" w:type="dxa"/>
             <w:vAlign w:val="center"/>
             <w:hideMark/>
           </w:tcPr>
@@ -8021,7 +7989,7 @@
         </w:tc>
         <w:tc>
           <w:tcPr>
-            <w:tcW w:w="0" w:type="auto"/>
+            <w:tcW w:w="4888" w:type="dxa"/>
             <w:vAlign w:val="center"/>
             <w:hideMark/>
           </w:tcPr>
@@ -8096,7 +8064,7 @@
         </w:trPr>
         <w:tc>
           <w:tcPr>
-            <w:tcW w:w="0" w:type="auto"/>
+            <w:tcW w:w="522" w:type="dxa"/>
             <w:vAlign w:val="center"/>
             <w:hideMark/>
           </w:tcPr>
@@ -8108,7 +8076,7 @@
         </w:tc>
         <w:tc>
           <w:tcPr>
-            <w:tcW w:w="0" w:type="auto"/>
+            <w:tcW w:w="4888" w:type="dxa"/>
             <w:vAlign w:val="center"/>
             <w:hideMark/>
           </w:tcPr>
@@ -8175,7 +8143,7 @@
         </w:trPr>
         <w:tc>
           <w:tcPr>
-            <w:tcW w:w="0" w:type="auto"/>
+            <w:tcW w:w="522" w:type="dxa"/>
             <w:vAlign w:val="center"/>
             <w:hideMark/>
           </w:tcPr>
@@ -8187,7 +8155,7 @@
         </w:tc>
         <w:tc>
           <w:tcPr>
-            <w:tcW w:w="0" w:type="auto"/>
+            <w:tcW w:w="4888" w:type="dxa"/>
             <w:vAlign w:val="center"/>
             <w:hideMark/>
           </w:tcPr>
@@ -8262,7 +8230,7 @@
         </w:trPr>
         <w:tc>
           <w:tcPr>
-            <w:tcW w:w="0" w:type="auto"/>
+            <w:tcW w:w="522" w:type="dxa"/>
             <w:vAlign w:val="center"/>
             <w:hideMark/>
           </w:tcPr>
@@ -8274,7 +8242,7 @@
         </w:tc>
         <w:tc>
           <w:tcPr>
-            <w:tcW w:w="0" w:type="auto"/>
+            <w:tcW w:w="4888" w:type="dxa"/>
             <w:vAlign w:val="center"/>
             <w:hideMark/>
           </w:tcPr>
@@ -8346,7 +8314,7 @@
         </w:trPr>
         <w:tc>
           <w:tcPr>
-            <w:tcW w:w="0" w:type="auto"/>
+            <w:tcW w:w="522" w:type="dxa"/>
             <w:vAlign w:val="center"/>
             <w:hideMark/>
           </w:tcPr>
@@ -8358,7 +8326,7 @@
         </w:tc>
         <w:tc>
           <w:tcPr>
-            <w:tcW w:w="0" w:type="auto"/>
+            <w:tcW w:w="4888" w:type="dxa"/>
             <w:vAlign w:val="center"/>
             <w:hideMark/>
           </w:tcPr>
@@ -8433,7 +8401,7 @@
         </w:trPr>
         <w:tc>
           <w:tcPr>
-            <w:tcW w:w="0" w:type="auto"/>
+            <w:tcW w:w="522" w:type="dxa"/>
             <w:vAlign w:val="center"/>
             <w:hideMark/>
           </w:tcPr>
@@ -8445,7 +8413,7 @@
         </w:tc>
         <w:tc>
           <w:tcPr>
-            <w:tcW w:w="0" w:type="auto"/>
+            <w:tcW w:w="4888" w:type="dxa"/>
             <w:vAlign w:val="center"/>
             <w:hideMark/>
           </w:tcPr>
@@ -8541,7 +8509,7 @@
         </w:trPr>
         <w:tc>
           <w:tcPr>
-            <w:tcW w:w="0" w:type="auto"/>
+            <w:tcW w:w="522" w:type="dxa"/>
             <w:vAlign w:val="center"/>
             <w:hideMark/>
           </w:tcPr>
@@ -8553,7 +8521,7 @@
         </w:tc>
         <w:tc>
           <w:tcPr>
-            <w:tcW w:w="0" w:type="auto"/>
+            <w:tcW w:w="4888" w:type="dxa"/>
             <w:vAlign w:val="center"/>
             <w:hideMark/>
           </w:tcPr>
@@ -8628,7 +8596,7 @@
         </w:trPr>
         <w:tc>
           <w:tcPr>
-            <w:tcW w:w="0" w:type="auto"/>
+            <w:tcW w:w="522" w:type="dxa"/>
             <w:vAlign w:val="center"/>
             <w:hideMark/>
           </w:tcPr>
@@ -8640,7 +8608,7 @@
         </w:tc>
         <w:tc>
           <w:tcPr>
-            <w:tcW w:w="0" w:type="auto"/>
+            <w:tcW w:w="4888" w:type="dxa"/>
             <w:vAlign w:val="center"/>
             <w:hideMark/>
           </w:tcPr>
@@ -8731,7 +8699,7 @@
         </w:trPr>
         <w:tc>
           <w:tcPr>
-            <w:tcW w:w="0" w:type="auto"/>
+            <w:tcW w:w="522" w:type="dxa"/>
             <w:vAlign w:val="center"/>
             <w:hideMark/>
           </w:tcPr>
@@ -8743,7 +8711,7 @@
         </w:tc>
         <w:tc>
           <w:tcPr>
-            <w:tcW w:w="0" w:type="auto"/>
+            <w:tcW w:w="4888" w:type="dxa"/>
             <w:vAlign w:val="center"/>
             <w:hideMark/>
           </w:tcPr>
@@ -8818,7 +8786,7 @@
         </w:trPr>
         <w:tc>
           <w:tcPr>
-            <w:tcW w:w="0" w:type="auto"/>
+            <w:tcW w:w="522" w:type="dxa"/>
             <w:vAlign w:val="center"/>
             <w:hideMark/>
           </w:tcPr>
@@ -8830,7 +8798,7 @@
         </w:tc>
         <w:tc>
           <w:tcPr>
-            <w:tcW w:w="0" w:type="auto"/>
+            <w:tcW w:w="4888" w:type="dxa"/>
             <w:vAlign w:val="center"/>
             <w:hideMark/>
           </w:tcPr>
@@ -8910,19 +8878,20 @@
         </w:trPr>
         <w:tc>
           <w:tcPr>
-            <w:tcW w:w="0" w:type="auto"/>
-            <w:vAlign w:val="center"/>
-            <w:hideMark/>
-          </w:tcPr>
-          <w:p>
-            <w:r>
+            <w:tcW w:w="522" w:type="dxa"/>
+            <w:vAlign w:val="center"/>
+            <w:hideMark/>
+          </w:tcPr>
+          <w:p>
+            <w:r>
+              <w:lastRenderedPageBreak/>
               <w:t>14</w:t>
             </w:r>
           </w:p>
         </w:tc>
         <w:tc>
           <w:tcPr>
-            <w:tcW w:w="0" w:type="auto"/>
+            <w:tcW w:w="4888" w:type="dxa"/>
             <w:vAlign w:val="center"/>
             <w:hideMark/>
           </w:tcPr>
@@ -8997,20 +8966,19 @@
         </w:trPr>
         <w:tc>
           <w:tcPr>
-            <w:tcW w:w="0" w:type="auto"/>
-            <w:vAlign w:val="center"/>
-            <w:hideMark/>
-          </w:tcPr>
-          <w:p>
-            <w:r>
-              <w:lastRenderedPageBreak/>
+            <w:tcW w:w="522" w:type="dxa"/>
+            <w:vAlign w:val="center"/>
+            <w:hideMark/>
+          </w:tcPr>
+          <w:p>
+            <w:r>
               <w:t>15</w:t>
             </w:r>
           </w:p>
         </w:tc>
         <w:tc>
           <w:tcPr>
-            <w:tcW w:w="0" w:type="auto"/>
+            <w:tcW w:w="4888" w:type="dxa"/>
             <w:vAlign w:val="center"/>
             <w:hideMark/>
           </w:tcPr>
@@ -9116,7 +9084,7 @@
         </w:trPr>
         <w:tc>
           <w:tcPr>
-            <w:tcW w:w="0" w:type="auto"/>
+            <w:tcW w:w="522" w:type="dxa"/>
             <w:vAlign w:val="center"/>
             <w:hideMark/>
           </w:tcPr>
@@ -9128,7 +9096,7 @@
         </w:tc>
         <w:tc>
           <w:tcPr>
-            <w:tcW w:w="0" w:type="auto"/>
+            <w:tcW w:w="4888" w:type="dxa"/>
             <w:vAlign w:val="center"/>
             <w:hideMark/>
           </w:tcPr>
@@ -9195,7 +9163,7 @@
         </w:trPr>
         <w:tc>
           <w:tcPr>
-            <w:tcW w:w="0" w:type="auto"/>
+            <w:tcW w:w="522" w:type="dxa"/>
             <w:vAlign w:val="center"/>
             <w:hideMark/>
           </w:tcPr>
@@ -9207,7 +9175,7 @@
         </w:tc>
         <w:tc>
           <w:tcPr>
-            <w:tcW w:w="0" w:type="auto"/>
+            <w:tcW w:w="4888" w:type="dxa"/>
             <w:vAlign w:val="center"/>
             <w:hideMark/>
           </w:tcPr>
@@ -9290,7 +9258,7 @@
         </w:trPr>
         <w:tc>
           <w:tcPr>
-            <w:tcW w:w="0" w:type="auto"/>
+            <w:tcW w:w="522" w:type="dxa"/>
             <w:vAlign w:val="center"/>
             <w:hideMark/>
           </w:tcPr>
@@ -9302,7 +9270,7 @@
         </w:tc>
         <w:tc>
           <w:tcPr>
-            <w:tcW w:w="0" w:type="auto"/>
+            <w:tcW w:w="4888" w:type="dxa"/>
             <w:vAlign w:val="center"/>
             <w:hideMark/>
           </w:tcPr>
@@ -9387,7 +9355,7 @@
         </w:trPr>
         <w:tc>
           <w:tcPr>
-            <w:tcW w:w="0" w:type="auto"/>
+            <w:tcW w:w="522" w:type="dxa"/>
             <w:vAlign w:val="center"/>
             <w:hideMark/>
           </w:tcPr>
@@ -9399,7 +9367,7 @@
         </w:tc>
         <w:tc>
           <w:tcPr>
-            <w:tcW w:w="0" w:type="auto"/>
+            <w:tcW w:w="4888" w:type="dxa"/>
             <w:vAlign w:val="center"/>
             <w:hideMark/>
           </w:tcPr>
@@ -9477,7 +9445,7 @@
         </w:trPr>
         <w:tc>
           <w:tcPr>
-            <w:tcW w:w="0" w:type="auto"/>
+            <w:tcW w:w="522" w:type="dxa"/>
             <w:vAlign w:val="center"/>
             <w:hideMark/>
           </w:tcPr>
@@ -9489,7 +9457,7 @@
         </w:tc>
         <w:tc>
           <w:tcPr>
-            <w:tcW w:w="0" w:type="auto"/>
+            <w:tcW w:w="4888" w:type="dxa"/>
             <w:vAlign w:val="center"/>
             <w:hideMark/>
           </w:tcPr>
@@ -9591,7 +9559,7 @@
         </w:trPr>
         <w:tc>
           <w:tcPr>
-            <w:tcW w:w="0" w:type="auto"/>
+            <w:tcW w:w="522" w:type="dxa"/>
             <w:vAlign w:val="center"/>
             <w:hideMark/>
           </w:tcPr>
@@ -9603,7 +9571,7 @@
         </w:tc>
         <w:tc>
           <w:tcPr>
-            <w:tcW w:w="0" w:type="auto"/>
+            <w:tcW w:w="4888" w:type="dxa"/>
             <w:vAlign w:val="center"/>
             <w:hideMark/>
           </w:tcPr>
@@ -9681,7 +9649,7 @@
         </w:trPr>
         <w:tc>
           <w:tcPr>
-            <w:tcW w:w="0" w:type="auto"/>
+            <w:tcW w:w="522" w:type="dxa"/>
             <w:vAlign w:val="center"/>
             <w:hideMark/>
           </w:tcPr>
@@ -9693,7 +9661,7 @@
         </w:tc>
         <w:tc>
           <w:tcPr>
-            <w:tcW w:w="0" w:type="auto"/>
+            <w:tcW w:w="4888" w:type="dxa"/>
             <w:vAlign w:val="center"/>
             <w:hideMark/>
           </w:tcPr>
@@ -9772,7 +9740,7 @@
         </w:trPr>
         <w:tc>
           <w:tcPr>
-            <w:tcW w:w="0" w:type="auto"/>
+            <w:tcW w:w="522" w:type="dxa"/>
             <w:vAlign w:val="center"/>
             <w:hideMark/>
           </w:tcPr>
@@ -9784,7 +9752,7 @@
         </w:tc>
         <w:tc>
           <w:tcPr>
-            <w:tcW w:w="0" w:type="auto"/>
+            <w:tcW w:w="4888" w:type="dxa"/>
             <w:vAlign w:val="center"/>
             <w:hideMark/>
           </w:tcPr>
@@ -9843,7 +9811,7 @@
     <w:p>
       <w:r>
         <w:pict w14:anchorId="48C47000">
-          <v:rect id="_x0000_i1073" style="width:0;height:1.5pt" o:hralign="center" o:hrstd="t" o:hr="t" fillcolor="#a0a0a0" stroked="f"/>
+          <v:rect id="_x0000_i1031" style="width:0;height:1.5pt" o:hralign="center" o:hrstd="t" o:hr="t" fillcolor="#a0a0a0" stroked="f"/>
         </w:pict>
       </w:r>
     </w:p>
@@ -10322,6 +10290,7 @@
           <w:p>
             <w:proofErr w:type="spellStart"/>
             <w:r>
+              <w:lastRenderedPageBreak/>
               <w:t>Vercel</w:t>
             </w:r>
             <w:proofErr w:type="spellEnd"/>
@@ -10382,6 +10351,998 @@
         </w:tc>
       </w:tr>
     </w:tbl>
+    <w:p/>
+    <w:p>
+      <w:r>
+        <w:t xml:space="preserve">*** </w:t>
+      </w:r>
+      <w:r>
+        <w:t xml:space="preserve">Google </w:t>
+      </w:r>
+      <w:proofErr w:type="spellStart"/>
+      <w:r>
+        <w:t>Ads'e</w:t>
+      </w:r>
+      <w:proofErr w:type="spellEnd"/>
+      <w:r>
+        <w:t xml:space="preserve"> şunu diyebilirsin: </w:t>
+      </w:r>
+      <w:r>
+        <w:rPr>
+          <w:i/>
+          <w:iCs/>
+        </w:rPr>
+        <w:t xml:space="preserve">"Sitede 30 saniyeden az kalıp WhatsApp'a tıklayanları değil, </w:t>
+      </w:r>
+      <w:r>
+        <w:rPr>
+          <w:b/>
+          <w:bCs/>
+          <w:i/>
+          <w:iCs/>
+        </w:rPr>
+        <w:t>30 saniyeden fazla kalıp</w:t>
+      </w:r>
+      <w:r>
+        <w:rPr>
+          <w:i/>
+          <w:iCs/>
+        </w:rPr>
+        <w:t xml:space="preserve"> WhatsApp'a tıklayanları gerçek dönüşüm (</w:t>
+      </w:r>
+      <w:proofErr w:type="spellStart"/>
+      <w:r>
+        <w:rPr>
+          <w:i/>
+          <w:iCs/>
+        </w:rPr>
+        <w:t>conversion</w:t>
+      </w:r>
+      <w:proofErr w:type="spellEnd"/>
+      <w:r>
+        <w:rPr>
+          <w:i/>
+          <w:iCs/>
+        </w:rPr>
+        <w:t>) olarak say."</w:t>
+      </w:r>
+    </w:p>
+    <w:p>
+      <w:r>
+        <w:t>Bu sayede Google, reklamlarını gerçekten okuyan ve ilgilenen kişilere göstermeye odaklanır.</w:t>
+      </w:r>
+    </w:p>
+    <w:p>
+      <w:pPr>
+        <w:rPr>
+          <w:b/>
+          <w:bCs/>
+        </w:rPr>
+      </w:pPr>
+      <w:r>
+        <w:t>---</w:t>
+      </w:r>
+      <w:r>
+        <w:rPr>
+          <w:rFonts w:ascii="Times New Roman" w:eastAsia="Times New Roman" w:hAnsi="Times New Roman" w:cs="Times New Roman"/>
+          <w:b/>
+          <w:bCs/>
+          <w:kern w:val="0"/>
+          <w:sz w:val="27"/>
+          <w:szCs w:val="27"/>
+          <w14:ligatures w14:val="none"/>
+        </w:rPr>
+        <w:t xml:space="preserve"> </w:t>
+      </w:r>
+      <w:r>
+        <w:rPr>
+          <w:b/>
+          <w:bCs/>
+        </w:rPr>
+        <w:t>Bu Verileri Nasıl Kullanmalısın?</w:t>
+      </w:r>
+    </w:p>
+    <w:p>
+      <w:r>
+        <w:t xml:space="preserve">Bu listeyi </w:t>
+      </w:r>
+      <w:proofErr w:type="spellStart"/>
+      <w:r>
+        <w:t>dataLayer</w:t>
+      </w:r>
+      <w:proofErr w:type="spellEnd"/>
+      <w:r>
+        <w:t xml:space="preserve"> içine </w:t>
+      </w:r>
+      <w:proofErr w:type="spellStart"/>
+      <w:r>
+        <w:rPr>
+          <w:b/>
+          <w:bCs/>
+        </w:rPr>
+        <w:t>snake_case</w:t>
+      </w:r>
+      <w:proofErr w:type="spellEnd"/>
+      <w:r>
+        <w:t xml:space="preserve"> olarak kurduktan sonra:</w:t>
+      </w:r>
+    </w:p>
+    <w:p>
+      <w:pPr>
+        <w:numPr>
+          <w:ilvl w:val="0"/>
+          <w:numId w:val="11"/>
+        </w:numPr>
+      </w:pPr>
+      <w:proofErr w:type="spellStart"/>
+      <w:r>
+        <w:rPr>
+          <w:b/>
+          <w:bCs/>
+        </w:rPr>
+        <w:t>GTM'de</w:t>
+      </w:r>
+      <w:proofErr w:type="spellEnd"/>
+      <w:r>
+        <w:t xml:space="preserve"> her biri için birer "Data </w:t>
+      </w:r>
+      <w:proofErr w:type="spellStart"/>
+      <w:r>
+        <w:t>Layer</w:t>
+      </w:r>
+      <w:proofErr w:type="spellEnd"/>
+      <w:r>
+        <w:t xml:space="preserve"> </w:t>
+      </w:r>
+      <w:proofErr w:type="spellStart"/>
+      <w:r>
+        <w:t>Variable</w:t>
+      </w:r>
+      <w:proofErr w:type="spellEnd"/>
+      <w:r>
+        <w:t>" oluştur.</w:t>
+      </w:r>
+    </w:p>
+    <w:p>
+      <w:pPr>
+        <w:numPr>
+          <w:ilvl w:val="0"/>
+          <w:numId w:val="11"/>
+        </w:numPr>
+      </w:pPr>
+      <w:r>
+        <w:rPr>
+          <w:b/>
+          <w:bCs/>
+        </w:rPr>
+        <w:t>GA4 Etiketine</w:t>
+      </w:r>
+      <w:r>
+        <w:t xml:space="preserve"> bu değişkenleri "</w:t>
+      </w:r>
+      <w:proofErr w:type="spellStart"/>
+      <w:r>
+        <w:t>Event</w:t>
+      </w:r>
+      <w:proofErr w:type="spellEnd"/>
+      <w:r>
+        <w:t xml:space="preserve"> </w:t>
+      </w:r>
+      <w:proofErr w:type="spellStart"/>
+      <w:r>
+        <w:t>Parameters</w:t>
+      </w:r>
+      <w:proofErr w:type="spellEnd"/>
+      <w:r>
+        <w:t>" olarak ekle.</w:t>
+      </w:r>
+    </w:p>
+    <w:p>
+      <w:pPr>
+        <w:numPr>
+          <w:ilvl w:val="0"/>
+          <w:numId w:val="11"/>
+        </w:numPr>
+      </w:pPr>
+      <w:r>
+        <w:rPr>
+          <w:b/>
+          <w:bCs/>
+        </w:rPr>
+        <w:t>GA4 Panelinde</w:t>
+      </w:r>
+      <w:r>
+        <w:t xml:space="preserve"> "</w:t>
+      </w:r>
+      <w:proofErr w:type="spellStart"/>
+      <w:r>
+        <w:t>Custom</w:t>
+      </w:r>
+      <w:proofErr w:type="spellEnd"/>
+      <w:r>
+        <w:t xml:space="preserve"> </w:t>
+      </w:r>
+      <w:proofErr w:type="spellStart"/>
+      <w:r>
+        <w:t>Dimensions</w:t>
+      </w:r>
+      <w:proofErr w:type="spellEnd"/>
+      <w:r>
+        <w:t>" olarak tanımla.</w:t>
+      </w:r>
+    </w:p>
+    <w:p>
+      <w:r>
+        <w:t xml:space="preserve">Bu yapı kurulduğunda, Google </w:t>
+      </w:r>
+      <w:proofErr w:type="spellStart"/>
+      <w:r>
+        <w:t>Ads</w:t>
+      </w:r>
+      <w:proofErr w:type="spellEnd"/>
+      <w:r>
+        <w:t xml:space="preserve"> paneline sadece "WhatsApp'a tıklandı" değil, </w:t>
+      </w:r>
+      <w:r>
+        <w:rPr>
+          <w:b/>
+          <w:bCs/>
+        </w:rPr>
+        <w:t>"Bağcılar'dan gelen, lüks konut projesinde 40 saniye vakit geçiren ve sayfanın %80'ini okuyan bir sıcak müşteri adayı geldi"</w:t>
+      </w:r>
+      <w:r>
+        <w:t xml:space="preserve"> bilgisini vermiş olursun.</w:t>
+      </w:r>
+    </w:p>
+    <w:p>
+      <w:pPr>
+        <w:rPr>
+          <w:b/>
+          <w:bCs/>
+        </w:rPr>
+      </w:pPr>
+      <w:r>
+        <w:t>**</w:t>
+      </w:r>
+      <w:r>
+        <w:rPr>
+          <w:rFonts w:ascii="Times New Roman" w:eastAsia="Times New Roman" w:hAnsi="Times New Roman" w:cs="Times New Roman"/>
+          <w:b/>
+          <w:bCs/>
+          <w:color w:val="E3E3E3"/>
+          <w:kern w:val="0"/>
+          <w:sz w:val="36"/>
+          <w:szCs w:val="36"/>
+          <w14:ligatures w14:val="none"/>
+        </w:rPr>
+        <w:t xml:space="preserve"> </w:t>
+      </w:r>
+      <w:r>
+        <w:rPr>
+          <w:b/>
+          <w:bCs/>
+        </w:rPr>
+        <w:t>Gemini şunu dedi:</w:t>
+      </w:r>
+    </w:p>
+    <w:p>
+      <w:r>
+        <w:t xml:space="preserve">Evet, kesinlikle olur ve profesyonel bir </w:t>
+      </w:r>
+      <w:proofErr w:type="spellStart"/>
+      <w:r>
+        <w:rPr>
+          <w:b/>
+          <w:bCs/>
+        </w:rPr>
+        <w:t>Growth</w:t>
+      </w:r>
+      <w:proofErr w:type="spellEnd"/>
+      <w:r>
+        <w:rPr>
+          <w:b/>
+          <w:bCs/>
+        </w:rPr>
+        <w:t xml:space="preserve"> </w:t>
+      </w:r>
+      <w:proofErr w:type="spellStart"/>
+      <w:r>
+        <w:rPr>
+          <w:b/>
+          <w:bCs/>
+        </w:rPr>
+        <w:t>Engineer</w:t>
+      </w:r>
+      <w:proofErr w:type="spellEnd"/>
+      <w:r>
+        <w:t xml:space="preserve"> kurulumunda olması gereken tam olarak budur.</w:t>
+      </w:r>
+    </w:p>
+    <w:p>
+      <w:r>
+        <w:t>Tek bir WhatsApp tıklama etkinliği (</w:t>
+      </w:r>
+      <w:proofErr w:type="spellStart"/>
+      <w:r>
+        <w:t>event</w:t>
+      </w:r>
+      <w:proofErr w:type="spellEnd"/>
+      <w:r>
+        <w:t>: '</w:t>
+      </w:r>
+      <w:proofErr w:type="spellStart"/>
+      <w:r>
+        <w:t>whatsapp_click</w:t>
+      </w:r>
+      <w:proofErr w:type="spellEnd"/>
+      <w:r>
+        <w:t>') içerisinde tüm değişkenleri (</w:t>
+      </w:r>
+      <w:proofErr w:type="spellStart"/>
+      <w:r>
+        <w:t>variables</w:t>
+      </w:r>
+      <w:proofErr w:type="spellEnd"/>
+      <w:r>
+        <w:t xml:space="preserve">) göndermek hem veri bütünlüğünü sağlar hem de Google </w:t>
+      </w:r>
+      <w:proofErr w:type="spellStart"/>
+      <w:r>
+        <w:t>Tag</w:t>
+      </w:r>
+      <w:proofErr w:type="spellEnd"/>
+      <w:r>
+        <w:t xml:space="preserve"> Manager (GTM) tarafındaki karmaşayı önler.</w:t>
+      </w:r>
+    </w:p>
+    <w:p>
+      <w:r>
+        <w:t>İşte bu yapıyı tek bir paket (</w:t>
+      </w:r>
+      <w:proofErr w:type="spellStart"/>
+      <w:r>
+        <w:t>payload</w:t>
+      </w:r>
+      <w:proofErr w:type="spellEnd"/>
+      <w:r>
+        <w:t>) olarak nasıl kurman gerektiği:</w:t>
+      </w:r>
+    </w:p>
+    <w:p>
+      <w:pPr>
+        <w:rPr>
+          <w:b/>
+          <w:bCs/>
+        </w:rPr>
+      </w:pPr>
+      <w:r>
+        <w:rPr>
+          <w:b/>
+          <w:bCs/>
+        </w:rPr>
+        <w:t>1. Kod Tarafındaki Yapı (</w:t>
+      </w:r>
+      <w:proofErr w:type="spellStart"/>
+      <w:r>
+        <w:rPr>
+          <w:b/>
+          <w:bCs/>
+        </w:rPr>
+        <w:t>DataLayer</w:t>
+      </w:r>
+      <w:proofErr w:type="spellEnd"/>
+      <w:r>
+        <w:rPr>
+          <w:b/>
+          <w:bCs/>
+        </w:rPr>
+        <w:t xml:space="preserve"> </w:t>
+      </w:r>
+      <w:proofErr w:type="spellStart"/>
+      <w:r>
+        <w:rPr>
+          <w:b/>
+          <w:bCs/>
+        </w:rPr>
+        <w:t>Push</w:t>
+      </w:r>
+      <w:proofErr w:type="spellEnd"/>
+      <w:r>
+        <w:rPr>
+          <w:b/>
+          <w:bCs/>
+        </w:rPr>
+        <w:t>)</w:t>
+      </w:r>
+    </w:p>
+    <w:p>
+      <w:r>
+        <w:t>Butona tıklandığında şu blok tek seferde fırlatılır. GTM bu paketi açtığında içindeki tüm verilere aynı anda erişebilir:</w:t>
+      </w:r>
+    </w:p>
+    <w:p>
+      <w:r>
+        <w:t>JavaScript</w:t>
+      </w:r>
+    </w:p>
+    <w:p>
+      <w:proofErr w:type="spellStart"/>
+      <w:proofErr w:type="gramStart"/>
+      <w:r>
+        <w:t>window.dataLayer.push</w:t>
+      </w:r>
+      <w:proofErr w:type="spellEnd"/>
+      <w:proofErr w:type="gramEnd"/>
+      <w:r>
+        <w:t>({</w:t>
+      </w:r>
+    </w:p>
+    <w:p>
+      <w:r>
+        <w:t xml:space="preserve">  '</w:t>
+      </w:r>
+      <w:proofErr w:type="spellStart"/>
+      <w:r>
+        <w:t>event</w:t>
+      </w:r>
+      <w:proofErr w:type="spellEnd"/>
+      <w:r>
+        <w:t>': '</w:t>
+      </w:r>
+      <w:proofErr w:type="spellStart"/>
+      <w:r>
+        <w:t>whatsapp_click</w:t>
+      </w:r>
+      <w:proofErr w:type="spellEnd"/>
+      <w:r>
+        <w:t>',</w:t>
+      </w:r>
+    </w:p>
+    <w:p>
+      <w:r>
+        <w:t xml:space="preserve">  // Sayfa ve İçerik</w:t>
+      </w:r>
+    </w:p>
+    <w:p>
+      <w:r>
+        <w:lastRenderedPageBreak/>
+        <w:t xml:space="preserve">  '</w:t>
+      </w:r>
+      <w:proofErr w:type="spellStart"/>
+      <w:r>
+        <w:t>sayfa_yolu</w:t>
+      </w:r>
+      <w:proofErr w:type="spellEnd"/>
+      <w:r>
+        <w:t xml:space="preserve">': </w:t>
+      </w:r>
+      <w:proofErr w:type="spellStart"/>
+      <w:proofErr w:type="gramStart"/>
+      <w:r>
+        <w:t>window.location</w:t>
+      </w:r>
+      <w:proofErr w:type="gramEnd"/>
+      <w:r>
+        <w:t>.pathname</w:t>
+      </w:r>
+      <w:proofErr w:type="spellEnd"/>
+      <w:r>
+        <w:t>,</w:t>
+      </w:r>
+    </w:p>
+    <w:p>
+      <w:r>
+        <w:t xml:space="preserve">  '</w:t>
+      </w:r>
+      <w:proofErr w:type="spellStart"/>
+      <w:r>
+        <w:t>proje_adi</w:t>
+      </w:r>
+      <w:proofErr w:type="spellEnd"/>
+      <w:r>
+        <w:t>': 'suzen_konaklari_etap_2',</w:t>
+      </w:r>
+    </w:p>
+    <w:p>
+      <w:r>
+        <w:t xml:space="preserve">  '</w:t>
+      </w:r>
+      <w:proofErr w:type="spellStart"/>
+      <w:r>
+        <w:t>icerik_kategorisi</w:t>
+      </w:r>
+      <w:proofErr w:type="spellEnd"/>
+      <w:r>
+        <w:t>': '</w:t>
+      </w:r>
+      <w:proofErr w:type="spellStart"/>
+      <w:r>
+        <w:t>luks_konut</w:t>
+      </w:r>
+      <w:proofErr w:type="spellEnd"/>
+      <w:r>
+        <w:t>',</w:t>
+      </w:r>
+    </w:p>
+    <w:p>
+      <w:r>
+        <w:t xml:space="preserve">  // Davranışsal</w:t>
+      </w:r>
+    </w:p>
+    <w:p>
+      <w:r>
+        <w:t xml:space="preserve">  '</w:t>
+      </w:r>
+      <w:proofErr w:type="spellStart"/>
+      <w:r>
+        <w:t>sayfada_gecirilen_sure</w:t>
+      </w:r>
+      <w:proofErr w:type="spellEnd"/>
+      <w:r>
+        <w:t>': 45, // saniye cinsinden</w:t>
+      </w:r>
+    </w:p>
+    <w:p>
+      <w:r>
+        <w:t xml:space="preserve">  '</w:t>
+      </w:r>
+      <w:proofErr w:type="spellStart"/>
+      <w:r>
+        <w:t>kaydirma_orani</w:t>
+      </w:r>
+      <w:proofErr w:type="spellEnd"/>
+      <w:r>
+        <w:t>': '%75',</w:t>
+      </w:r>
+    </w:p>
+    <w:p>
+      <w:r>
+        <w:t xml:space="preserve">  '</w:t>
+      </w:r>
+      <w:proofErr w:type="spellStart"/>
+      <w:r>
+        <w:t>ziyaret_sayisi</w:t>
+      </w:r>
+      <w:proofErr w:type="spellEnd"/>
+      <w:r>
+        <w:t>': 2,</w:t>
+      </w:r>
+    </w:p>
+    <w:p>
+      <w:r>
+        <w:t xml:space="preserve">  // Buton ve Arayüz</w:t>
+      </w:r>
+    </w:p>
+    <w:p>
+      <w:r>
+        <w:t xml:space="preserve">  '</w:t>
+      </w:r>
+      <w:proofErr w:type="spellStart"/>
+      <w:r>
+        <w:t>buton_konumu</w:t>
+      </w:r>
+      <w:proofErr w:type="spellEnd"/>
+      <w:r>
+        <w:t>': '</w:t>
+      </w:r>
+      <w:proofErr w:type="spellStart"/>
+      <w:r>
+        <w:t>yuzen_ikon</w:t>
+      </w:r>
+      <w:proofErr w:type="spellEnd"/>
+      <w:r>
+        <w:t>',</w:t>
+      </w:r>
+    </w:p>
+    <w:p>
+      <w:r>
+        <w:t xml:space="preserve">  '</w:t>
+      </w:r>
+      <w:proofErr w:type="spellStart"/>
+      <w:r>
+        <w:t>buton_metni</w:t>
+      </w:r>
+      <w:proofErr w:type="spellEnd"/>
+      <w:r>
+        <w:t>': 'WhatsApp ile Teklif Al',</w:t>
+      </w:r>
+    </w:p>
+    <w:p>
+      <w:r>
+        <w:t xml:space="preserve">  // Teknik</w:t>
+      </w:r>
+    </w:p>
+    <w:p>
+      <w:r>
+        <w:t xml:space="preserve">  '</w:t>
+      </w:r>
+      <w:proofErr w:type="spellStart"/>
+      <w:r>
+        <w:t>cihaz_turu</w:t>
+      </w:r>
+      <w:proofErr w:type="spellEnd"/>
+      <w:r>
+        <w:t>': 'mobil',</w:t>
+      </w:r>
+    </w:p>
+    <w:p>
+      <w:r>
+        <w:t xml:space="preserve">  '</w:t>
+      </w:r>
+      <w:proofErr w:type="spellStart"/>
+      <w:r>
+        <w:t>baglanti_hizi</w:t>
+      </w:r>
+      <w:proofErr w:type="spellEnd"/>
+      <w:r>
+        <w:t>': '4g'</w:t>
+      </w:r>
+    </w:p>
+    <w:p>
+      <w:r>
+        <w:t>});</w:t>
+      </w:r>
+    </w:p>
+    <w:p>
+      <w:r>
+        <w:pict w14:anchorId="792FBBCB">
+          <v:rect id="_x0000_i1044" style="width:0;height:1.5pt" o:hralign="center" o:hrstd="t" o:hr="t" fillcolor="#a0a0a0" stroked="f"/>
+        </w:pict>
+      </w:r>
+    </w:p>
+    <w:p>
+      <w:pPr>
+        <w:rPr>
+          <w:b/>
+          <w:bCs/>
+        </w:rPr>
+      </w:pPr>
+      <w:r>
+        <w:rPr>
+          <w:b/>
+          <w:bCs/>
+        </w:rPr>
+        <w:t>2. Neden "Tek Bir Seferde" Göndermelisin?</w:t>
+      </w:r>
+    </w:p>
+    <w:p>
+      <w:pPr>
+        <w:numPr>
+          <w:ilvl w:val="0"/>
+          <w:numId w:val="12"/>
+        </w:numPr>
+      </w:pPr>
+      <w:r>
+        <w:rPr>
+          <w:b/>
+          <w:bCs/>
+        </w:rPr>
+        <w:t>Veri Senkronizasyonu:</w:t>
+      </w:r>
+      <w:r>
+        <w:t xml:space="preserve"> Tüm veriler aynı "</w:t>
+      </w:r>
+      <w:proofErr w:type="spellStart"/>
+      <w:r>
+        <w:t>an"ı</w:t>
+      </w:r>
+      <w:proofErr w:type="spellEnd"/>
+      <w:r>
+        <w:t xml:space="preserve"> temsil eder. Kullanıcı o saniye hangi sayfadaysa, ne kadar süredir oradaysa hepsi o tıklama ile mühürlenir.</w:t>
+      </w:r>
+    </w:p>
+    <w:p>
+      <w:pPr>
+        <w:numPr>
+          <w:ilvl w:val="0"/>
+          <w:numId w:val="12"/>
+        </w:numPr>
+      </w:pPr>
+      <w:r>
+        <w:rPr>
+          <w:b/>
+          <w:bCs/>
+        </w:rPr>
+        <w:t>GTM Verimliliği:</w:t>
+      </w:r>
+      <w:r>
+        <w:t xml:space="preserve"> </w:t>
+      </w:r>
+      <w:proofErr w:type="spellStart"/>
+      <w:r>
+        <w:t>GTM'de</w:t>
+      </w:r>
+      <w:proofErr w:type="spellEnd"/>
+      <w:r>
+        <w:t xml:space="preserve"> tek bir tetikleyici (</w:t>
+      </w:r>
+      <w:proofErr w:type="spellStart"/>
+      <w:r>
+        <w:t>Trigger</w:t>
+      </w:r>
+      <w:proofErr w:type="spellEnd"/>
+      <w:r>
+        <w:t xml:space="preserve">) kurarsın. Bu tetikleyici çalıştığında, GTM "Hah, WhatsApp tıklandı! Şimdi bu paketin içindeki 10 değişkeni alıp GA4'e ve Google </w:t>
+      </w:r>
+      <w:proofErr w:type="spellStart"/>
+      <w:r>
+        <w:t>Ads'e</w:t>
+      </w:r>
+      <w:proofErr w:type="spellEnd"/>
+      <w:r>
+        <w:t xml:space="preserve"> dağıtıyorum" der.</w:t>
+      </w:r>
+    </w:p>
+    <w:p>
+      <w:pPr>
+        <w:numPr>
+          <w:ilvl w:val="0"/>
+          <w:numId w:val="12"/>
+        </w:numPr>
+      </w:pPr>
+      <w:r>
+        <w:rPr>
+          <w:b/>
+          <w:bCs/>
+        </w:rPr>
+        <w:t>Analiz Kolaylığı:</w:t>
+      </w:r>
+      <w:r>
+        <w:t xml:space="preserve"> GA4'e bu veriler gittiğinde, bir "WhatsApp" etkinliğinin yanındaki boyutlara baktığında tüm bu parametreleri yan yana görebilirsin.</w:t>
+      </w:r>
+    </w:p>
+    <w:p>
+      <w:r>
+        <w:pict w14:anchorId="3744570E">
+          <v:rect id="_x0000_i1045" style="width:0;height:1.5pt" o:hralign="center" o:hrstd="t" o:hr="t" fillcolor="#a0a0a0" stroked="f"/>
+        </w:pict>
+      </w:r>
+    </w:p>
+    <w:p>
+      <w:pPr>
+        <w:rPr>
+          <w:b/>
+          <w:bCs/>
+        </w:rPr>
+      </w:pPr>
+      <w:r>
+        <w:rPr>
+          <w:b/>
+          <w:bCs/>
+        </w:rPr>
+        <w:t>3. GTM ve GA4'te Nasıl Görünür?</w:t>
+      </w:r>
+    </w:p>
+    <w:p>
+      <w:r>
+        <w:t xml:space="preserve">GTM panelinde </w:t>
+      </w:r>
+      <w:r>
+        <w:rPr>
+          <w:b/>
+          <w:bCs/>
+        </w:rPr>
+        <w:t xml:space="preserve">GA4 </w:t>
+      </w:r>
+      <w:proofErr w:type="spellStart"/>
+      <w:r>
+        <w:rPr>
+          <w:b/>
+          <w:bCs/>
+        </w:rPr>
+        <w:t>Event</w:t>
+      </w:r>
+      <w:proofErr w:type="spellEnd"/>
+      <w:r>
+        <w:rPr>
+          <w:b/>
+          <w:bCs/>
+        </w:rPr>
+        <w:t xml:space="preserve"> </w:t>
+      </w:r>
+      <w:proofErr w:type="spellStart"/>
+      <w:r>
+        <w:rPr>
+          <w:b/>
+          <w:bCs/>
+        </w:rPr>
+        <w:t>Tag</w:t>
+      </w:r>
+      <w:proofErr w:type="spellEnd"/>
+      <w:r>
+        <w:t xml:space="preserve"> oluştururken:</w:t>
+      </w:r>
+    </w:p>
+    <w:p>
+      <w:pPr>
+        <w:numPr>
+          <w:ilvl w:val="0"/>
+          <w:numId w:val="13"/>
+        </w:numPr>
+      </w:pPr>
+      <w:proofErr w:type="spellStart"/>
+      <w:r>
+        <w:rPr>
+          <w:b/>
+          <w:bCs/>
+        </w:rPr>
+        <w:t>Event</w:t>
+      </w:r>
+      <w:proofErr w:type="spellEnd"/>
+      <w:r>
+        <w:rPr>
+          <w:b/>
+          <w:bCs/>
+        </w:rPr>
+        <w:t xml:space="preserve"> Name:</w:t>
+      </w:r>
+      <w:r>
+        <w:t xml:space="preserve"> </w:t>
+      </w:r>
+      <w:proofErr w:type="spellStart"/>
+      <w:r>
+        <w:t>whatsapp_click</w:t>
+      </w:r>
+      <w:proofErr w:type="spellEnd"/>
+      <w:r>
+        <w:t xml:space="preserve"> yazarsın.</w:t>
+      </w:r>
+    </w:p>
+    <w:p>
+      <w:pPr>
+        <w:numPr>
+          <w:ilvl w:val="0"/>
+          <w:numId w:val="13"/>
+        </w:numPr>
+      </w:pPr>
+      <w:proofErr w:type="spellStart"/>
+      <w:r>
+        <w:rPr>
+          <w:b/>
+          <w:bCs/>
+        </w:rPr>
+        <w:t>Event</w:t>
+      </w:r>
+      <w:proofErr w:type="spellEnd"/>
+      <w:r>
+        <w:rPr>
+          <w:b/>
+          <w:bCs/>
+        </w:rPr>
+        <w:t xml:space="preserve"> </w:t>
+      </w:r>
+      <w:proofErr w:type="spellStart"/>
+      <w:r>
+        <w:rPr>
+          <w:b/>
+          <w:bCs/>
+        </w:rPr>
+        <w:t>Parameters</w:t>
+      </w:r>
+      <w:proofErr w:type="spellEnd"/>
+      <w:r>
+        <w:rPr>
+          <w:b/>
+          <w:bCs/>
+        </w:rPr>
+        <w:t>:</w:t>
+      </w:r>
+      <w:r>
+        <w:t xml:space="preserve"> Alt alta 10 satır açarsın ve her birine sol tarafa parametre adını (</w:t>
+      </w:r>
+      <w:proofErr w:type="spellStart"/>
+      <w:r>
+        <w:t>proje_adi</w:t>
+      </w:r>
+      <w:proofErr w:type="spellEnd"/>
+      <w:r>
+        <w:t>), sağ tarafa ise değişkeni ({{</w:t>
+      </w:r>
+      <w:proofErr w:type="gramStart"/>
+      <w:r>
+        <w:t>DLV -</w:t>
+      </w:r>
+      <w:proofErr w:type="gramEnd"/>
+      <w:r>
+        <w:t xml:space="preserve"> </w:t>
+      </w:r>
+      <w:proofErr w:type="spellStart"/>
+      <w:r>
+        <w:t>proje_adi</w:t>
+      </w:r>
+      <w:proofErr w:type="spellEnd"/>
+      <w:r>
+        <w:t>}}) bağlarsın.</w:t>
+      </w:r>
+    </w:p>
+    <w:p>
+      <w:pPr>
+        <w:rPr>
+          <w:b/>
+          <w:bCs/>
+        </w:rPr>
+      </w:pPr>
+      <w:r>
+        <w:rPr>
+          <w:b/>
+          <w:bCs/>
+        </w:rPr>
+        <w:t>4. Dikkat Etmen Gereken Küçük Bir Detay</w:t>
+      </w:r>
+    </w:p>
+    <w:p>
+      <w:r>
+        <w:lastRenderedPageBreak/>
+        <w:t xml:space="preserve">Eğer bu 10 değişkeni her WhatsApp tıklamasında göndereceksen, </w:t>
+      </w:r>
+      <w:proofErr w:type="spellStart"/>
+      <w:r>
+        <w:t>GTM'de</w:t>
+      </w:r>
+      <w:proofErr w:type="spellEnd"/>
+      <w:r>
+        <w:t xml:space="preserve"> bu değişkenlerin her birini </w:t>
+      </w:r>
+      <w:r>
+        <w:rPr>
+          <w:b/>
+          <w:bCs/>
+        </w:rPr>
+        <w:t xml:space="preserve">"Data </w:t>
+      </w:r>
+      <w:proofErr w:type="spellStart"/>
+      <w:r>
+        <w:rPr>
+          <w:b/>
+          <w:bCs/>
+        </w:rPr>
+        <w:t>Layer</w:t>
+      </w:r>
+      <w:proofErr w:type="spellEnd"/>
+      <w:r>
+        <w:rPr>
+          <w:b/>
+          <w:bCs/>
+        </w:rPr>
+        <w:t xml:space="preserve"> </w:t>
+      </w:r>
+      <w:proofErr w:type="spellStart"/>
+      <w:r>
+        <w:rPr>
+          <w:b/>
+          <w:bCs/>
+        </w:rPr>
+        <w:t>Variable</w:t>
+      </w:r>
+      <w:proofErr w:type="spellEnd"/>
+      <w:r>
+        <w:rPr>
+          <w:b/>
+          <w:bCs/>
+        </w:rPr>
+        <w:t>"</w:t>
+      </w:r>
+      <w:r>
+        <w:t xml:space="preserve"> olarak bir kez tanımlamış olman gerekir. Bir kez tanımladıktan sonra istediğin her etikette (Facebook </w:t>
+      </w:r>
+      <w:proofErr w:type="spellStart"/>
+      <w:r>
+        <w:t>Pixel</w:t>
+      </w:r>
+      <w:proofErr w:type="spellEnd"/>
+      <w:r>
+        <w:t xml:space="preserve">, Google </w:t>
+      </w:r>
+      <w:proofErr w:type="spellStart"/>
+      <w:r>
+        <w:t>Ads</w:t>
+      </w:r>
+      <w:proofErr w:type="spellEnd"/>
+      <w:r>
+        <w:t>, GA4) bu değişkenleri tekrar tekrar kullanabilirsin.</w:t>
+      </w:r>
+    </w:p>
+    <w:p/>
     <w:p/>
     <w:sectPr>
       <w:pgSz w:w="11906" w:h="16838"/>
@@ -10771,6 +11732,119 @@
     </w:lvl>
   </w:abstractNum>
   <w:abstractNum w:abstractNumId="3" w15:restartNumberingAfterBreak="0">
+    <w:nsid w:val="2EEB1774"/>
+    <w:multiLevelType w:val="multilevel"/>
+    <w:tmpl w:val="D5A48C14"/>
+    <w:lvl w:ilvl="0">
+      <w:start w:val="1"/>
+      <w:numFmt w:val="decimal"/>
+      <w:lvlText w:val="%1."/>
+      <w:lvlJc w:val="left"/>
+      <w:pPr>
+        <w:tabs>
+          <w:tab w:val="num" w:pos="720"/>
+        </w:tabs>
+        <w:ind w:left="720" w:hanging="360"/>
+      </w:pPr>
+    </w:lvl>
+    <w:lvl w:ilvl="1" w:tentative="1">
+      <w:start w:val="1"/>
+      <w:numFmt w:val="decimal"/>
+      <w:lvlText w:val="%2."/>
+      <w:lvlJc w:val="left"/>
+      <w:pPr>
+        <w:tabs>
+          <w:tab w:val="num" w:pos="1440"/>
+        </w:tabs>
+        <w:ind w:left="1440" w:hanging="360"/>
+      </w:pPr>
+    </w:lvl>
+    <w:lvl w:ilvl="2" w:tentative="1">
+      <w:start w:val="1"/>
+      <w:numFmt w:val="decimal"/>
+      <w:lvlText w:val="%3."/>
+      <w:lvlJc w:val="left"/>
+      <w:pPr>
+        <w:tabs>
+          <w:tab w:val="num" w:pos="2160"/>
+        </w:tabs>
+        <w:ind w:left="2160" w:hanging="360"/>
+      </w:pPr>
+    </w:lvl>
+    <w:lvl w:ilvl="3" w:tentative="1">
+      <w:start w:val="1"/>
+      <w:numFmt w:val="decimal"/>
+      <w:lvlText w:val="%4."/>
+      <w:lvlJc w:val="left"/>
+      <w:pPr>
+        <w:tabs>
+          <w:tab w:val="num" w:pos="2880"/>
+        </w:tabs>
+        <w:ind w:left="2880" w:hanging="360"/>
+      </w:pPr>
+    </w:lvl>
+    <w:lvl w:ilvl="4" w:tentative="1">
+      <w:start w:val="1"/>
+      <w:numFmt w:val="decimal"/>
+      <w:lvlText w:val="%5."/>
+      <w:lvlJc w:val="left"/>
+      <w:pPr>
+        <w:tabs>
+          <w:tab w:val="num" w:pos="3600"/>
+        </w:tabs>
+        <w:ind w:left="3600" w:hanging="360"/>
+      </w:pPr>
+    </w:lvl>
+    <w:lvl w:ilvl="5" w:tentative="1">
+      <w:start w:val="1"/>
+      <w:numFmt w:val="decimal"/>
+      <w:lvlText w:val="%6."/>
+      <w:lvlJc w:val="left"/>
+      <w:pPr>
+        <w:tabs>
+          <w:tab w:val="num" w:pos="4320"/>
+        </w:tabs>
+        <w:ind w:left="4320" w:hanging="360"/>
+      </w:pPr>
+    </w:lvl>
+    <w:lvl w:ilvl="6" w:tentative="1">
+      <w:start w:val="1"/>
+      <w:numFmt w:val="decimal"/>
+      <w:lvlText w:val="%7."/>
+      <w:lvlJc w:val="left"/>
+      <w:pPr>
+        <w:tabs>
+          <w:tab w:val="num" w:pos="5040"/>
+        </w:tabs>
+        <w:ind w:left="5040" w:hanging="360"/>
+      </w:pPr>
+    </w:lvl>
+    <w:lvl w:ilvl="7" w:tentative="1">
+      <w:start w:val="1"/>
+      <w:numFmt w:val="decimal"/>
+      <w:lvlText w:val="%8."/>
+      <w:lvlJc w:val="left"/>
+      <w:pPr>
+        <w:tabs>
+          <w:tab w:val="num" w:pos="5760"/>
+        </w:tabs>
+        <w:ind w:left="5760" w:hanging="360"/>
+      </w:pPr>
+    </w:lvl>
+    <w:lvl w:ilvl="8" w:tentative="1">
+      <w:start w:val="1"/>
+      <w:numFmt w:val="decimal"/>
+      <w:lvlText w:val="%9."/>
+      <w:lvlJc w:val="left"/>
+      <w:pPr>
+        <w:tabs>
+          <w:tab w:val="num" w:pos="6480"/>
+        </w:tabs>
+        <w:ind w:left="6480" w:hanging="360"/>
+      </w:pPr>
+    </w:lvl>
+  </w:abstractNum>
+  <w:abstractNum w:abstractNumId="4" w15:restartNumberingAfterBreak="0">
     <w:nsid w:val="35EE3AA0"/>
     <w:multiLevelType w:val="multilevel"/>
     <w:tmpl w:val="726049DA"/>
@@ -10919,7 +11993,7 @@
       </w:rPr>
     </w:lvl>
   </w:abstractNum>
-  <w:abstractNum w:abstractNumId="4" w15:restartNumberingAfterBreak="0">
+  <w:abstractNum w:abstractNumId="5" w15:restartNumberingAfterBreak="0">
     <w:nsid w:val="402A57F5"/>
     <w:multiLevelType w:val="multilevel"/>
     <w:tmpl w:val="0F5C7D38"/>
@@ -11068,7 +12142,7 @@
       </w:rPr>
     </w:lvl>
   </w:abstractNum>
-  <w:abstractNum w:abstractNumId="5" w15:restartNumberingAfterBreak="0">
+  <w:abstractNum w:abstractNumId="6" w15:restartNumberingAfterBreak="0">
     <w:nsid w:val="49B85D0C"/>
     <w:multiLevelType w:val="multilevel"/>
     <w:tmpl w:val="A81E29D2"/>
@@ -11181,7 +12255,7 @@
       </w:pPr>
     </w:lvl>
   </w:abstractNum>
-  <w:abstractNum w:abstractNumId="6" w15:restartNumberingAfterBreak="0">
+  <w:abstractNum w:abstractNumId="7" w15:restartNumberingAfterBreak="0">
     <w:nsid w:val="4B815CEC"/>
     <w:multiLevelType w:val="multilevel"/>
     <w:tmpl w:val="0D909B3A"/>
@@ -11330,7 +12404,120 @@
       </w:rPr>
     </w:lvl>
   </w:abstractNum>
-  <w:abstractNum w:abstractNumId="7" w15:restartNumberingAfterBreak="0">
+  <w:abstractNum w:abstractNumId="8" w15:restartNumberingAfterBreak="0">
+    <w:nsid w:val="5A6B7C44"/>
+    <w:multiLevelType w:val="multilevel"/>
+    <w:tmpl w:val="0B64521A"/>
+    <w:lvl w:ilvl="0">
+      <w:start w:val="1"/>
+      <w:numFmt w:val="decimal"/>
+      <w:lvlText w:val="%1."/>
+      <w:lvlJc w:val="left"/>
+      <w:pPr>
+        <w:tabs>
+          <w:tab w:val="num" w:pos="720"/>
+        </w:tabs>
+        <w:ind w:left="720" w:hanging="360"/>
+      </w:pPr>
+    </w:lvl>
+    <w:lvl w:ilvl="1" w:tentative="1">
+      <w:start w:val="1"/>
+      <w:numFmt w:val="decimal"/>
+      <w:lvlText w:val="%2."/>
+      <w:lvlJc w:val="left"/>
+      <w:pPr>
+        <w:tabs>
+          <w:tab w:val="num" w:pos="1440"/>
+        </w:tabs>
+        <w:ind w:left="1440" w:hanging="360"/>
+      </w:pPr>
+    </w:lvl>
+    <w:lvl w:ilvl="2" w:tentative="1">
+      <w:start w:val="1"/>
+      <w:numFmt w:val="decimal"/>
+      <w:lvlText w:val="%3."/>
+      <w:lvlJc w:val="left"/>
+      <w:pPr>
+        <w:tabs>
+          <w:tab w:val="num" w:pos="2160"/>
+        </w:tabs>
+        <w:ind w:left="2160" w:hanging="360"/>
+      </w:pPr>
+    </w:lvl>
+    <w:lvl w:ilvl="3" w:tentative="1">
+      <w:start w:val="1"/>
+      <w:numFmt w:val="decimal"/>
+      <w:lvlText w:val="%4."/>
+      <w:lvlJc w:val="left"/>
+      <w:pPr>
+        <w:tabs>
+          <w:tab w:val="num" w:pos="2880"/>
+        </w:tabs>
+        <w:ind w:left="2880" w:hanging="360"/>
+      </w:pPr>
+    </w:lvl>
+    <w:lvl w:ilvl="4" w:tentative="1">
+      <w:start w:val="1"/>
+      <w:numFmt w:val="decimal"/>
+      <w:lvlText w:val="%5."/>
+      <w:lvlJc w:val="left"/>
+      <w:pPr>
+        <w:tabs>
+          <w:tab w:val="num" w:pos="3600"/>
+        </w:tabs>
+        <w:ind w:left="3600" w:hanging="360"/>
+      </w:pPr>
+    </w:lvl>
+    <w:lvl w:ilvl="5" w:tentative="1">
+      <w:start w:val="1"/>
+      <w:numFmt w:val="decimal"/>
+      <w:lvlText w:val="%6."/>
+      <w:lvlJc w:val="left"/>
+      <w:pPr>
+        <w:tabs>
+          <w:tab w:val="num" w:pos="4320"/>
+        </w:tabs>
+        <w:ind w:left="4320" w:hanging="360"/>
+      </w:pPr>
+    </w:lvl>
+    <w:lvl w:ilvl="6" w:tentative="1">
+      <w:start w:val="1"/>
+      <w:numFmt w:val="decimal"/>
+      <w:lvlText w:val="%7."/>
+      <w:lvlJc w:val="left"/>
+      <w:pPr>
+        <w:tabs>
+          <w:tab w:val="num" w:pos="5040"/>
+        </w:tabs>
+        <w:ind w:left="5040" w:hanging="360"/>
+      </w:pPr>
+    </w:lvl>
+    <w:lvl w:ilvl="7" w:tentative="1">
+      <w:start w:val="1"/>
+      <w:numFmt w:val="decimal"/>
+      <w:lvlText w:val="%8."/>
+      <w:lvlJc w:val="left"/>
+      <w:pPr>
+        <w:tabs>
+          <w:tab w:val="num" w:pos="5760"/>
+        </w:tabs>
+        <w:ind w:left="5760" w:hanging="360"/>
+      </w:pPr>
+    </w:lvl>
+    <w:lvl w:ilvl="8" w:tentative="1">
+      <w:start w:val="1"/>
+      <w:numFmt w:val="decimal"/>
+      <w:lvlText w:val="%9."/>
+      <w:lvlJc w:val="left"/>
+      <w:pPr>
+        <w:tabs>
+          <w:tab w:val="num" w:pos="6480"/>
+        </w:tabs>
+        <w:ind w:left="6480" w:hanging="360"/>
+      </w:pPr>
+    </w:lvl>
+  </w:abstractNum>
+  <w:abstractNum w:abstractNumId="9" w15:restartNumberingAfterBreak="0">
     <w:nsid w:val="72933D62"/>
     <w:multiLevelType w:val="multilevel"/>
     <w:tmpl w:val="4F5025E6"/>
@@ -11443,7 +12630,7 @@
       </w:pPr>
     </w:lvl>
   </w:abstractNum>
-  <w:abstractNum w:abstractNumId="8" w15:restartNumberingAfterBreak="0">
+  <w:abstractNum w:abstractNumId="10" w15:restartNumberingAfterBreak="0">
     <w:nsid w:val="729916DF"/>
     <w:multiLevelType w:val="multilevel"/>
     <w:tmpl w:val="5920A216"/>
@@ -11556,7 +12743,156 @@
       </w:pPr>
     </w:lvl>
   </w:abstractNum>
-  <w:abstractNum w:abstractNumId="9" w15:restartNumberingAfterBreak="0">
+  <w:abstractNum w:abstractNumId="11" w15:restartNumberingAfterBreak="0">
+    <w:nsid w:val="72CF4677"/>
+    <w:multiLevelType w:val="multilevel"/>
+    <w:tmpl w:val="2A382D4A"/>
+    <w:lvl w:ilvl="0">
+      <w:start w:val="1"/>
+      <w:numFmt w:val="bullet"/>
+      <w:lvlText w:val=""/>
+      <w:lvlJc w:val="left"/>
+      <w:pPr>
+        <w:tabs>
+          <w:tab w:val="num" w:pos="720"/>
+        </w:tabs>
+        <w:ind w:left="720" w:hanging="360"/>
+      </w:pPr>
+      <w:rPr>
+        <w:rFonts w:ascii="Symbol" w:hAnsi="Symbol" w:hint="default"/>
+        <w:sz w:val="20"/>
+      </w:rPr>
+    </w:lvl>
+    <w:lvl w:ilvl="1" w:tentative="1">
+      <w:start w:val="1"/>
+      <w:numFmt w:val="bullet"/>
+      <w:lvlText w:val=""/>
+      <w:lvlJc w:val="left"/>
+      <w:pPr>
+        <w:tabs>
+          <w:tab w:val="num" w:pos="1440"/>
+        </w:tabs>
+        <w:ind w:left="1440" w:hanging="360"/>
+      </w:pPr>
+      <w:rPr>
+        <w:rFonts w:ascii="Symbol" w:hAnsi="Symbol" w:hint="default"/>
+        <w:sz w:val="20"/>
+      </w:rPr>
+    </w:lvl>
+    <w:lvl w:ilvl="2" w:tentative="1">
+      <w:start w:val="1"/>
+      <w:numFmt w:val="bullet"/>
+      <w:lvlText w:val=""/>
+      <w:lvlJc w:val="left"/>
+      <w:pPr>
+        <w:tabs>
+          <w:tab w:val="num" w:pos="2160"/>
+        </w:tabs>
+        <w:ind w:left="2160" w:hanging="360"/>
+      </w:pPr>
+      <w:rPr>
+        <w:rFonts w:ascii="Symbol" w:hAnsi="Symbol" w:hint="default"/>
+        <w:sz w:val="20"/>
+      </w:rPr>
+    </w:lvl>
+    <w:lvl w:ilvl="3" w:tentative="1">
+      <w:start w:val="1"/>
+      <w:numFmt w:val="bullet"/>
+      <w:lvlText w:val=""/>
+      <w:lvlJc w:val="left"/>
+      <w:pPr>
+        <w:tabs>
+          <w:tab w:val="num" w:pos="2880"/>
+        </w:tabs>
+        <w:ind w:left="2880" w:hanging="360"/>
+      </w:pPr>
+      <w:rPr>
+        <w:rFonts w:ascii="Symbol" w:hAnsi="Symbol" w:hint="default"/>
+        <w:sz w:val="20"/>
+      </w:rPr>
+    </w:lvl>
+    <w:lvl w:ilvl="4" w:tentative="1">
+      <w:start w:val="1"/>
+      <w:numFmt w:val="bullet"/>
+      <w:lvlText w:val=""/>
+      <w:lvlJc w:val="left"/>
+      <w:pPr>
+        <w:tabs>
+          <w:tab w:val="num" w:pos="3600"/>
+        </w:tabs>
+        <w:ind w:left="3600" w:hanging="360"/>
+      </w:pPr>
+      <w:rPr>
+        <w:rFonts w:ascii="Symbol" w:hAnsi="Symbol" w:hint="default"/>
+        <w:sz w:val="20"/>
+      </w:rPr>
+    </w:lvl>
+    <w:lvl w:ilvl="5" w:tentative="1">
+      <w:start w:val="1"/>
+      <w:numFmt w:val="bullet"/>
+      <w:lvlText w:val=""/>
+      <w:lvlJc w:val="left"/>
+      <w:pPr>
+        <w:tabs>
+          <w:tab w:val="num" w:pos="4320"/>
+        </w:tabs>
+        <w:ind w:left="4320" w:hanging="360"/>
+      </w:pPr>
+      <w:rPr>
+        <w:rFonts w:ascii="Symbol" w:hAnsi="Symbol" w:hint="default"/>
+        <w:sz w:val="20"/>
+      </w:rPr>
+    </w:lvl>
+    <w:lvl w:ilvl="6" w:tentative="1">
+      <w:start w:val="1"/>
+      <w:numFmt w:val="bullet"/>
+      <w:lvlText w:val=""/>
+      <w:lvlJc w:val="left"/>
+      <w:pPr>
+        <w:tabs>
+          <w:tab w:val="num" w:pos="5040"/>
+        </w:tabs>
+        <w:ind w:left="5040" w:hanging="360"/>
+      </w:pPr>
+      <w:rPr>
+        <w:rFonts w:ascii="Symbol" w:hAnsi="Symbol" w:hint="default"/>
+        <w:sz w:val="20"/>
+      </w:rPr>
+    </w:lvl>
+    <w:lvl w:ilvl="7" w:tentative="1">
+      <w:start w:val="1"/>
+      <w:numFmt w:val="bullet"/>
+      <w:lvlText w:val=""/>
+      <w:lvlJc w:val="left"/>
+      <w:pPr>
+        <w:tabs>
+          <w:tab w:val="num" w:pos="5760"/>
+        </w:tabs>
+        <w:ind w:left="5760" w:hanging="360"/>
+      </w:pPr>
+      <w:rPr>
+        <w:rFonts w:ascii="Symbol" w:hAnsi="Symbol" w:hint="default"/>
+        <w:sz w:val="20"/>
+      </w:rPr>
+    </w:lvl>
+    <w:lvl w:ilvl="8" w:tentative="1">
+      <w:start w:val="1"/>
+      <w:numFmt w:val="bullet"/>
+      <w:lvlText w:val=""/>
+      <w:lvlJc w:val="left"/>
+      <w:pPr>
+        <w:tabs>
+          <w:tab w:val="num" w:pos="6480"/>
+        </w:tabs>
+        <w:ind w:left="6480" w:hanging="360"/>
+      </w:pPr>
+      <w:rPr>
+        <w:rFonts w:ascii="Symbol" w:hAnsi="Symbol" w:hint="default"/>
+        <w:sz w:val="20"/>
+      </w:rPr>
+    </w:lvl>
+  </w:abstractNum>
+  <w:abstractNum w:abstractNumId="12" w15:restartNumberingAfterBreak="0">
     <w:nsid w:val="7B5E0DA2"/>
     <w:multiLevelType w:val="multilevel"/>
     <w:tmpl w:val="84AA0D82"/>
@@ -11670,34 +13006,43 @@
     </w:lvl>
   </w:abstractNum>
   <w:num w:numId="1" w16cid:durableId="1768770054">
-    <w:abstractNumId w:val="8"/>
+    <w:abstractNumId w:val="10"/>
   </w:num>
   <w:num w:numId="2" w16cid:durableId="1400012151">
-    <w:abstractNumId w:val="9"/>
+    <w:abstractNumId w:val="12"/>
   </w:num>
   <w:num w:numId="3" w16cid:durableId="2092893346">
     <w:abstractNumId w:val="0"/>
   </w:num>
   <w:num w:numId="4" w16cid:durableId="581111877">
-    <w:abstractNumId w:val="7"/>
+    <w:abstractNumId w:val="9"/>
   </w:num>
   <w:num w:numId="5" w16cid:durableId="1546327585">
-    <w:abstractNumId w:val="5"/>
+    <w:abstractNumId w:val="6"/>
   </w:num>
   <w:num w:numId="6" w16cid:durableId="282730350">
     <w:abstractNumId w:val="2"/>
   </w:num>
   <w:num w:numId="7" w16cid:durableId="825702351">
-    <w:abstractNumId w:val="4"/>
+    <w:abstractNumId w:val="5"/>
   </w:num>
   <w:num w:numId="8" w16cid:durableId="1632907016">
-    <w:abstractNumId w:val="3"/>
+    <w:abstractNumId w:val="4"/>
   </w:num>
   <w:num w:numId="9" w16cid:durableId="546452698">
     <w:abstractNumId w:val="1"/>
   </w:num>
   <w:num w:numId="10" w16cid:durableId="1332757442">
-    <w:abstractNumId w:val="6"/>
+    <w:abstractNumId w:val="7"/>
+  </w:num>
+  <w:num w:numId="11" w16cid:durableId="2132674446">
+    <w:abstractNumId w:val="8"/>
+  </w:num>
+  <w:num w:numId="12" w16cid:durableId="1858230478">
+    <w:abstractNumId w:val="11"/>
+  </w:num>
+  <w:num w:numId="13" w16cid:durableId="1046683840">
+    <w:abstractNumId w:val="3"/>
   </w:num>
 </w:numbering>
 </file>

</xml_diff>